<commit_message>
runs all the program sucessfully
</commit_message>
<xml_diff>
--- a/report/Carbon_Aware_ML_Germany_IEEEPES_Technical_Report.docx
+++ b/report/Carbon_Aware_ML_Germany_IEEEPES_Technical_Report.docx
@@ -366,7 +366,7 @@
           <w:rFonts w:ascii="Times New Roman" w:hAnsi="Times New Roman" w:eastAsia="Times New Roman"/>
           <w:sz w:val="21"/>
         </w:rPr>
-        <w:t>The best overall predictive model in the generated experiment is Histogram Gradient Boosting, with F1 = 0.899, ROC-AUC = 0.993, and an estimated training carbon proxy of 6.59 mg CO2e. The lowest-compute baseline is Linear SVM, with a much smaller carbon proxy (0.91 mg CO2e) but lower F1 (0.723). A carbon-aware training-window simulation indicates that scheduling the selected model into the lowest residual-load decile reduces the training carbon proxy by 31.9% relative to random-hour scheduling.</w:t>
+        <w:t>The best overall predictive model in the generated experiment is Histogram Gradient Boosting, with F1 = 0.897, ROC-AUC = 0.993, and an estimated training carbon proxy of 5.69 mg CO2e. The lowest-compute baseline is Logistic Regression, with a much smaller carbon proxy (0.23 mg CO2e) but lower F1 (0.728). A carbon-aware training-window simulation indicates that scheduling the selected model into the lowest residual-load decile reduces the training carbon proxy by 31.9% relative to random-hour scheduling.</w:t>
       </w:r>
     </w:p>
     <w:p>
@@ -1702,7 +1702,7 @@
           <w:rFonts w:ascii="Times New Roman" w:hAnsi="Times New Roman" w:eastAsia="Times New Roman"/>
           <w:sz w:val="21"/>
         </w:rPr>
-        <w:t>Histogram Gradient Boosting is the strongest predictive model, while Linear SVM is the lowest-compute baseline. The Pareto frontier therefore contains both high-accuracy and low-compute candidates. This is the main governance result: the preferred model depends on whether the deployment context values maximum event detection, minimum compute, or auditability.</w:t>
+        <w:t>Histogram Gradient Boosting is the strongest predictive model, while Logistic Regression is the lowest-compute baseline. The Pareto frontier therefore contains both high-accuracy and low-compute candidates. This is the main governance result: the preferred model depends on whether the deployment context values maximum event detection, minimum compute, or auditability.</w:t>
       </w:r>
     </w:p>
     <w:p>
@@ -1933,7 +1933,7 @@
                 <w:color w:val="141E28"/>
                 <w:sz w:val="15"/>
               </w:rPr>
-              <w:t>0.899</w:t>
+              <w:t>0.897</w:t>
             </w:r>
           </w:p>
         </w:tc>
@@ -1975,7 +1975,7 @@
                 <w:color w:val="141E28"/>
                 <w:sz w:val="15"/>
               </w:rPr>
-              <w:t>0.995</w:t>
+              <w:t>0.863</w:t>
             </w:r>
           </w:p>
         </w:tc>
@@ -1996,7 +1996,7 @@
                 <w:color w:val="141E28"/>
                 <w:sz w:val="15"/>
               </w:rPr>
-              <w:t>540.811</w:t>
+              <w:t>536.007</w:t>
             </w:r>
           </w:p>
         </w:tc>
@@ -2017,7 +2017,7 @@
                 <w:color w:val="141E28"/>
                 <w:sz w:val="15"/>
               </w:rPr>
-              <w:t>6.592</w:t>
+              <w:t>5.693</w:t>
             </w:r>
           </w:p>
         </w:tc>
@@ -2124,7 +2124,7 @@
                 <w:color w:val="141E28"/>
                 <w:sz w:val="15"/>
               </w:rPr>
-              <w:t>4.371</w:t>
+              <w:t>1.086</w:t>
             </w:r>
           </w:p>
         </w:tc>
@@ -2145,7 +2145,7 @@
                 <w:color w:val="141E28"/>
                 <w:sz w:val="15"/>
               </w:rPr>
-              <w:t>31.062</w:t>
+              <w:t>33.512</w:t>
             </w:r>
           </w:p>
         </w:tc>
@@ -2166,7 +2166,7 @@
                 <w:color w:val="141E28"/>
                 <w:sz w:val="15"/>
               </w:rPr>
-              <w:t>28.441</w:t>
+              <w:t>7.066</w:t>
             </w:r>
           </w:p>
         </w:tc>
@@ -2231,7 +2231,7 @@
                 <w:color w:val="141E28"/>
                 <w:sz w:val="15"/>
               </w:rPr>
-              <w:t>0.890</w:t>
+              <w:t>0.889</w:t>
             </w:r>
           </w:p>
         </w:tc>
@@ -2273,7 +2273,7 @@
                 <w:color w:val="141E28"/>
                 <w:sz w:val="15"/>
               </w:rPr>
-              <w:t>1.640</w:t>
+              <w:t>0.710</w:t>
             </w:r>
           </w:p>
         </w:tc>
@@ -2294,7 +2294,7 @@
                 <w:color w:val="141E28"/>
                 <w:sz w:val="15"/>
               </w:rPr>
-              <w:t>4745.292</w:t>
+              <w:t>4746.983</w:t>
             </w:r>
           </w:p>
         </w:tc>
@@ -2315,7 +2315,7 @@
                 <w:color w:val="141E28"/>
                 <w:sz w:val="15"/>
               </w:rPr>
-              <w:t>11.006</w:t>
+              <w:t>4.715</w:t>
             </w:r>
           </w:p>
         </w:tc>
@@ -2336,7 +2336,7 @@
                 <w:color w:val="141E28"/>
                 <w:sz w:val="15"/>
               </w:rPr>
-              <w:t>False</w:t>
+              <w:t>True</w:t>
             </w:r>
           </w:p>
         </w:tc>
@@ -2422,7 +2422,7 @@
                 <w:color w:val="141E28"/>
                 <w:sz w:val="15"/>
               </w:rPr>
-              <w:t>0.769</w:t>
+              <w:t>0.034</w:t>
             </w:r>
           </w:p>
         </w:tc>
@@ -2443,7 +2443,7 @@
                 <w:color w:val="141E28"/>
                 <w:sz w:val="15"/>
               </w:rPr>
-              <w:t>2.612</w:t>
+              <w:t>2.604</w:t>
             </w:r>
           </w:p>
         </w:tc>
@@ -2464,7 +2464,7 @@
                 <w:color w:val="141E28"/>
                 <w:sz w:val="15"/>
               </w:rPr>
-              <w:t>5.057</w:t>
+              <w:t>0.229</w:t>
             </w:r>
           </w:p>
         </w:tc>
@@ -2571,7 +2571,7 @@
                 <w:color w:val="141E28"/>
                 <w:sz w:val="15"/>
               </w:rPr>
-              <w:t>0.135</w:t>
+              <w:t>0.057</w:t>
             </w:r>
           </w:p>
         </w:tc>
@@ -2592,7 +2592,7 @@
                 <w:color w:val="141E28"/>
                 <w:sz w:val="15"/>
               </w:rPr>
-              <w:t>2.490</w:t>
+              <w:t>2.497</w:t>
             </w:r>
           </w:p>
         </w:tc>
@@ -2613,7 +2613,7 @@
                 <w:color w:val="141E28"/>
                 <w:sz w:val="15"/>
               </w:rPr>
-              <w:t>0.914</w:t>
+              <w:t>0.374</w:t>
             </w:r>
           </w:p>
         </w:tc>
@@ -2634,7 +2634,7 @@
                 <w:color w:val="141E28"/>
                 <w:sz w:val="15"/>
               </w:rPr>
-              <w:t>True</w:t>
+              <w:t>False</w:t>
             </w:r>
           </w:p>
         </w:tc>
@@ -2652,7 +2652,7 @@
       <w:r>
         <w:drawing>
           <wp:inline xmlns:a="http://schemas.openxmlformats.org/drawingml/2006/main" xmlns:pic="http://schemas.openxmlformats.org/drawingml/2006/picture">
-            <wp:extent cx="5989320" cy="3461808"/>
+            <wp:extent cx="5989320" cy="3428034"/>
             <wp:docPr id="2" name="Picture 2" title="Fig" descr="Fig. 2. Accuracy-carbon Pareto frontier for the five-model suite."/>
             <wp:cNvGraphicFramePr>
               <a:graphicFrameLocks noChangeAspect="1"/>
@@ -2673,7 +2673,7 @@
                   <pic:spPr>
                     <a:xfrm>
                       <a:off x="0" y="0"/>
-                      <a:ext cx="5989320" cy="3461808"/>
+                      <a:ext cx="5989320" cy="3428034"/>
                     </a:xfrm>
                     <a:prstGeom prst="rect"/>
                   </pic:spPr>
@@ -2933,7 +2933,7 @@
                 <w:color w:val="141E28"/>
                 <w:sz w:val="15"/>
               </w:rPr>
-              <w:t>0.813</w:t>
+              <w:t>0.811</w:t>
             </w:r>
           </w:p>
         </w:tc>
@@ -2954,7 +2954,7 @@
                 <w:color w:val="141E28"/>
                 <w:sz w:val="15"/>
               </w:rPr>
-              <w:t>0.982</w:t>
+              <w:t>0.981</w:t>
             </w:r>
           </w:p>
         </w:tc>
@@ -2975,7 +2975,7 @@
                 <w:color w:val="141E28"/>
                 <w:sz w:val="15"/>
               </w:rPr>
-              <w:t>5.526</w:t>
+              <w:t>5.107</w:t>
             </w:r>
           </w:p>
         </w:tc>
@@ -3040,7 +3040,7 @@
                 <w:color w:val="141E28"/>
                 <w:sz w:val="15"/>
               </w:rPr>
-              <w:t>0.904</w:t>
+              <w:t>0.902</w:t>
             </w:r>
           </w:p>
         </w:tc>
@@ -3082,7 +3082,7 @@
                 <w:color w:val="141E28"/>
                 <w:sz w:val="15"/>
               </w:rPr>
-              <w:t>5.290</w:t>
+              <w:t>4.854</w:t>
             </w:r>
           </w:p>
         </w:tc>
@@ -3147,7 +3147,7 @@
                 <w:color w:val="141E28"/>
                 <w:sz w:val="15"/>
               </w:rPr>
-              <w:t>0.889</w:t>
+              <w:t>0.893</w:t>
             </w:r>
           </w:p>
         </w:tc>
@@ -3168,7 +3168,7 @@
                 <w:color w:val="141E28"/>
                 <w:sz w:val="15"/>
               </w:rPr>
-              <w:t>0.992</w:t>
+              <w:t>0.993</w:t>
             </w:r>
           </w:p>
         </w:tc>
@@ -3189,7 +3189,7 @@
                 <w:color w:val="141E28"/>
                 <w:sz w:val="15"/>
               </w:rPr>
-              <w:t>5.951</w:t>
+              <w:t>4.740</w:t>
             </w:r>
           </w:p>
         </w:tc>
@@ -3296,7 +3296,7 @@
                 <w:color w:val="141E28"/>
                 <w:sz w:val="15"/>
               </w:rPr>
-              <w:t>6.420</w:t>
+              <w:t>5.150</w:t>
             </w:r>
           </w:p>
         </w:tc>
@@ -3361,7 +3361,7 @@
                 <w:color w:val="141E28"/>
                 <w:sz w:val="15"/>
               </w:rPr>
-              <w:t>0.899</w:t>
+              <w:t>0.897</w:t>
             </w:r>
           </w:p>
         </w:tc>
@@ -3403,7 +3403,7 @@
                 <w:color w:val="141E28"/>
                 <w:sz w:val="15"/>
               </w:rPr>
-              <w:t>6.007</w:t>
+              <w:t>5.291</w:t>
             </w:r>
           </w:p>
         </w:tc>
@@ -3681,7 +3681,7 @@
                 <w:color w:val="141E28"/>
                 <w:sz w:val="15"/>
               </w:rPr>
-              <w:t>0.968</w:t>
+              <w:t>0.966</w:t>
             </w:r>
           </w:p>
         </w:tc>
@@ -3702,7 +3702,7 @@
                 <w:color w:val="141E28"/>
                 <w:sz w:val="15"/>
               </w:rPr>
-              <w:t>0.848</w:t>
+              <w:t>0.847</w:t>
             </w:r>
           </w:p>
         </w:tc>
@@ -3723,7 +3723,7 @@
                 <w:color w:val="141E28"/>
                 <w:sz w:val="15"/>
               </w:rPr>
-              <w:t>0.749</w:t>
+              <w:t>0.739</w:t>
             </w:r>
           </w:p>
         </w:tc>
@@ -3744,7 +3744,7 @@
                 <w:color w:val="141E28"/>
                 <w:sz w:val="15"/>
               </w:rPr>
-              <w:t>0.866</w:t>
+              <w:t>0.864</w:t>
             </w:r>
           </w:p>
         </w:tc>
@@ -4109,7 +4109,7 @@
                 <w:color w:val="141E28"/>
                 <w:sz w:val="15"/>
               </w:rPr>
-              <w:t>0.961</w:t>
+              <w:t>0.960</w:t>
             </w:r>
           </w:p>
         </w:tc>
@@ -4151,7 +4151,7 @@
                 <w:color w:val="141E28"/>
                 <w:sz w:val="15"/>
               </w:rPr>
-              <w:t>0.690</w:t>
+              <w:t>0.695</w:t>
             </w:r>
           </w:p>
         </w:tc>
@@ -4172,7 +4172,7 @@
                 <w:color w:val="141E28"/>
                 <w:sz w:val="15"/>
               </w:rPr>
-              <w:t>0.871</w:t>
+              <w:t>0.868</w:t>
             </w:r>
           </w:p>
         </w:tc>
@@ -5563,7 +5563,7 @@
                 <w:color w:val="141E28"/>
                 <w:sz w:val="15"/>
               </w:rPr>
-              <w:t>4.490</w:t>
+              <w:t>3.878</w:t>
             </w:r>
           </w:p>
         </w:tc>
@@ -5670,7 +5670,7 @@
                 <w:color w:val="141E28"/>
                 <w:sz w:val="15"/>
               </w:rPr>
-              <w:t>6.592</w:t>
+              <w:t>5.693</w:t>
             </w:r>
           </w:p>
         </w:tc>
@@ -5777,7 +5777,7 @@
                 <w:color w:val="141E28"/>
                 <w:sz w:val="15"/>
               </w:rPr>
-              <w:t>7.947</w:t>
+              <w:t>6.863</w:t>
             </w:r>
           </w:p>
         </w:tc>
@@ -5821,7 +5821,7 @@
                 <w:color w:val="141E28"/>
                 <w:sz w:val="15"/>
               </w:rPr>
-              <w:t>Linear SVM</w:t>
+              <w:t>Logistic Regression</w:t>
             </w:r>
           </w:p>
         </w:tc>
@@ -5884,7 +5884,7 @@
                 <w:color w:val="141E28"/>
                 <w:sz w:val="15"/>
               </w:rPr>
-              <w:t>0.623</w:t>
+              <w:t>0.156</w:t>
             </w:r>
           </w:p>
         </w:tc>
@@ -5928,7 +5928,7 @@
                 <w:color w:val="141E28"/>
                 <w:sz w:val="15"/>
               </w:rPr>
-              <w:t>Linear SVM</w:t>
+              <w:t>Logistic Regression</w:t>
             </w:r>
           </w:p>
         </w:tc>
@@ -5991,7 +5991,7 @@
                 <w:color w:val="141E28"/>
                 <w:sz w:val="15"/>
               </w:rPr>
-              <w:t>0.914</w:t>
+              <w:t>0.229</w:t>
             </w:r>
           </w:p>
         </w:tc>
@@ -6035,7 +6035,7 @@
                 <w:color w:val="141E28"/>
                 <w:sz w:val="15"/>
               </w:rPr>
-              <w:t>Linear SVM</w:t>
+              <w:t>Logistic Regression</w:t>
             </w:r>
           </w:p>
         </w:tc>
@@ -6098,7 +6098,7 @@
                 <w:color w:val="141E28"/>
                 <w:sz w:val="15"/>
               </w:rPr>
-              <w:t>1.102</w:t>
+              <w:t>0.276</w:t>
             </w:r>
           </w:p>
         </w:tc>
@@ -6278,7 +6278,7 @@
           <w:rFonts w:ascii="Times New Roman" w:hAnsi="Times New Roman" w:eastAsia="Times New Roman"/>
           <w:sz w:val="21"/>
         </w:rPr>
-        <w:t>The recommended balanced model is Histogram Gradient Boosting, because it achieves the highest F1-score (0.899) with a modest carbon proxy and strong ROC-AUC (0.993). The recommended low-compute fallback is Linear SVM, which is appropriate when transparency, speed, and operational simplicity outweigh maximum predictive performance.</w:t>
+        <w:t>The recommended balanced model is Histogram Gradient Boosting, because it achieves the highest F1-score (0.897) with a modest carbon proxy and strong ROC-AUC (0.993). The recommended low-compute fallback is Logistic Regression, which is appropriate when transparency, speed, and operational simplicity outweigh maximum predictive performance.</w:t>
       </w:r>
     </w:p>
     <w:p>

</xml_diff>